<commit_message>
Updated design doc with ideas
</commit_message>
<xml_diff>
--- a/design.docx
+++ b/design.docx
@@ -18,14 +18,26 @@
       </w:r>
     </w:p>
     <w:p>
+      <w:r>
+        <w:t>Theme:</w:t>
+      </w:r>
+    </w:p>
+    <w:p>
+      <w:r>
+        <w:tab/>
+        <w:t xml:space="preserve">Ideas </w:t>
+      </w:r>
+    </w:p>
+    <w:p>
       <w:pPr>
+        <w:ind w:left="720" w:firstLine="720"/>
         <w:rPr>
           <w:b/>
           <w:bCs/>
         </w:rPr>
       </w:pPr>
       <w:r>
-        <w:t>Theme: TBD</w:t>
+        <w:t>Grim Dark (sim. to Warhammer)</w:t>
       </w:r>
     </w:p>
     <w:p>
@@ -77,15 +89,43 @@
     <w:p>
       <w:r>
         <w:tab/>
-        <w:t>Definite end with fulfilling requests as research</w:t>
+        <w:t>Ever increasing quota fulfilling</w:t>
       </w:r>
     </w:p>
     <w:p>
       <w:r>
         <w:tab/>
-        <w:t>End goal TBD</w:t>
+        <w:t>Separate quotas for research?</w:t>
       </w:r>
     </w:p>
+    <w:p>
+      <w:r>
+        <w:tab/>
+      </w:r>
+      <w:r>
+        <w:tab/>
+        <w:t>Maybe but would be hard to balance because people could just not research</w:t>
+      </w:r>
+    </w:p>
+    <w:p>
+      <w:r>
+        <w:tab/>
+      </w:r>
+      <w:r>
+        <w:tab/>
+        <w:t>Could just unlock buildings with regular quotas or have everything unlocked</w:t>
+      </w:r>
+    </w:p>
+    <w:p>
+      <w:r>
+        <w:tab/>
+      </w:r>
+      <w:r>
+        <w:tab/>
+        <w:t>Start with everything accessible because that’ll make programming easy</w:t>
+      </w:r>
+    </w:p>
+    <w:p/>
     <w:sectPr>
       <w:pgSz w:w="12240" w:h="15840"/>
       <w:pgMar w:top="1440" w:right="1440" w:bottom="1440" w:left="1440" w:header="720" w:footer="720" w:gutter="0"/>

</xml_diff>